<commit_message>
thêm kết nối mongodb atlas
</commit_message>
<xml_diff>
--- a/readme.docx
+++ b/readme.docx
@@ -179,7 +179,25 @@
           <w:sz w:val="24"/>
           <w:szCs w:val="24"/>
         </w:rPr>
-        <w:t>└── .env                 # Biến môi trường</w:t>
+        <w:t>└─</w:t>
+      </w:r>
+      <w:proofErr w:type="gramStart"/>
+      <w:r>
+        <w:rPr>
+          <w:rFonts w:ascii="Times New Roman" w:eastAsia="Times New Roman" w:hAnsi="Times New Roman" w:cs="Times New Roman"/>
+          <w:sz w:val="24"/>
+          <w:szCs w:val="24"/>
+        </w:rPr>
+        <w:t>─ .env</w:t>
+      </w:r>
+      <w:proofErr w:type="gramEnd"/>
+      <w:r>
+        <w:rPr>
+          <w:rFonts w:ascii="Times New Roman" w:eastAsia="Times New Roman" w:hAnsi="Times New Roman" w:cs="Times New Roman"/>
+          <w:sz w:val="24"/>
+          <w:szCs w:val="24"/>
+        </w:rPr>
+        <w:t xml:space="preserve">                 # Biến môi trường</w:t>
       </w:r>
     </w:p>
     <w:p>
@@ -594,10 +612,130 @@
           <w:rFonts w:ascii="Times New Roman" w:eastAsia="Times New Roman" w:hAnsi="Times New Roman" w:cs="Times New Roman"/>
           <w:b/>
           <w:bCs/>
-          <w:sz w:val="24"/>
-          <w:szCs w:val="24"/>
-        </w:rPr>
-      </w:pPr>
+          <w:color w:val="FF0000"/>
+          <w:sz w:val="24"/>
+          <w:szCs w:val="24"/>
+        </w:rPr>
+      </w:pPr>
+      <w:r>
+        <w:rPr>
+          <w:rFonts w:ascii="Times New Roman" w:eastAsia="Times New Roman" w:hAnsi="Times New Roman" w:cs="Times New Roman"/>
+          <w:b/>
+          <w:bCs/>
+          <w:color w:val="FF0000"/>
+          <w:sz w:val="24"/>
+          <w:szCs w:val="24"/>
+        </w:rPr>
+        <w:t>cấu hình MongoDB Atlas</w:t>
+      </w:r>
+    </w:p>
+    <w:p>
+      <w:pPr>
+        <w:spacing w:before="100" w:beforeAutospacing="1" w:after="100" w:afterAutospacing="1" w:line="240" w:lineRule="auto"/>
+        <w:rPr>
+          <w:rFonts w:ascii="Times New Roman" w:eastAsia="Times New Roman" w:hAnsi="Times New Roman" w:cs="Times New Roman"/>
+          <w:b/>
+          <w:bCs/>
+          <w:color w:val="FF0000"/>
+          <w:sz w:val="24"/>
+          <w:szCs w:val="24"/>
+        </w:rPr>
+      </w:pPr>
+      <w:r>
+        <w:rPr>
+          <w:rFonts w:ascii="Times New Roman" w:eastAsia="Times New Roman" w:hAnsi="Times New Roman" w:cs="Times New Roman"/>
+          <w:b/>
+          <w:bCs/>
+          <w:color w:val="FF0000"/>
+          <w:sz w:val="24"/>
+          <w:szCs w:val="24"/>
+        </w:rPr>
+        <w:t>username:</w:t>
+      </w:r>
+      <w:r>
+        <w:t xml:space="preserve"> </w:t>
+      </w:r>
+      <w:r>
+        <w:rPr>
+          <w:rFonts w:ascii="Times New Roman" w:eastAsia="Times New Roman" w:hAnsi="Times New Roman" w:cs="Times New Roman"/>
+          <w:b/>
+          <w:bCs/>
+          <w:color w:val="FF0000"/>
+          <w:sz w:val="24"/>
+          <w:szCs w:val="24"/>
+        </w:rPr>
+        <w:t>admin_db_user</w:t>
+      </w:r>
+    </w:p>
+    <w:p>
+      <w:pPr>
+        <w:spacing w:before="100" w:beforeAutospacing="1" w:after="100" w:afterAutospacing="1" w:line="240" w:lineRule="auto"/>
+        <w:rPr>
+          <w:rFonts w:ascii="Times New Roman" w:eastAsia="Times New Roman" w:hAnsi="Times New Roman" w:cs="Times New Roman"/>
+          <w:b/>
+          <w:bCs/>
+          <w:color w:val="FF0000"/>
+          <w:sz w:val="24"/>
+          <w:szCs w:val="24"/>
+        </w:rPr>
+      </w:pPr>
+      <w:r>
+        <w:rPr>
+          <w:rFonts w:ascii="Times New Roman" w:eastAsia="Times New Roman" w:hAnsi="Times New Roman" w:cs="Times New Roman"/>
+          <w:b/>
+          <w:bCs/>
+          <w:color w:val="FF0000"/>
+          <w:sz w:val="24"/>
+          <w:szCs w:val="24"/>
+        </w:rPr>
+        <w:t xml:space="preserve">password: </w:t>
+      </w:r>
+    </w:p>
+    <w:p>
+      <w:pPr>
+        <w:spacing w:before="100" w:beforeAutospacing="1" w:after="100" w:afterAutospacing="1" w:line="240" w:lineRule="auto"/>
+        <w:rPr>
+          <w:rFonts w:ascii="Times New Roman" w:eastAsia="Times New Roman" w:hAnsi="Times New Roman" w:cs="Times New Roman"/>
+          <w:b/>
+          <w:bCs/>
+          <w:color w:val="FF0000"/>
+          <w:sz w:val="24"/>
+          <w:szCs w:val="24"/>
+        </w:rPr>
+      </w:pPr>
+      <w:r>
+        <w:rPr>
+          <w:rFonts w:ascii="Times New Roman" w:eastAsia="Times New Roman" w:hAnsi="Times New Roman" w:cs="Times New Roman"/>
+          <w:b/>
+          <w:bCs/>
+          <w:color w:val="FF0000"/>
+          <w:sz w:val="24"/>
+          <w:szCs w:val="24"/>
+        </w:rPr>
+        <w:t>mongodb+srv://admin_db_user:</w:t>
+      </w:r>
+      <w:r>
+        <w:rPr>
+          <w:rFonts w:ascii="Times New Roman" w:eastAsia="Times New Roman" w:hAnsi="Times New Roman" w:cs="Times New Roman"/>
+          <w:b/>
+          <w:bCs/>
+          <w:color w:val="FF0000"/>
+          <w:sz w:val="24"/>
+          <w:szCs w:val="24"/>
+        </w:rPr>
+        <w:t>Ndje3p6JJlnp00Nb</w:t>
+      </w:r>
+      <w:r>
+        <w:rPr>
+          <w:rFonts w:ascii="Times New Roman" w:eastAsia="Times New Roman" w:hAnsi="Times New Roman" w:cs="Times New Roman"/>
+          <w:b/>
+          <w:bCs/>
+          <w:color w:val="FF0000"/>
+          <w:sz w:val="24"/>
+          <w:szCs w:val="24"/>
+        </w:rPr>
+        <w:t>@projectwdp301.i5kvbi7.mongodb.net/?appName=ProjectWDP301</w:t>
+      </w:r>
     </w:p>
     <w:p>
       <w:pPr>
@@ -995,6 +1133,7 @@
           <w:sz w:val="24"/>
           <w:szCs w:val="24"/>
         </w:rPr>
+        <w:lastRenderedPageBreak/>
         <w:t>Code bị trộn lẩu thập cẩm:</w:t>
       </w:r>
       <w:r>
@@ -1085,7 +1224,6 @@
           <w:sz w:val="24"/>
           <w:szCs w:val="24"/>
         </w:rPr>
-        <w:lastRenderedPageBreak/>
         <w:pict w14:anchorId="215A0E30">
           <v:rect id="_x0000_i1025" style="width:0;height:1.5pt" o:hralign="center" o:hrstd="t" o:hr="t" fillcolor="#a0a0a0" stroked="f"/>
         </w:pict>
@@ -2007,8 +2145,18 @@
           <w:sz w:val="20"/>
           <w:szCs w:val="20"/>
         </w:rPr>
-        <w:t>git checkout develop</w:t>
-      </w:r>
+        <w:t xml:space="preserve">git checkout </w:t>
+      </w:r>
+      <w:proofErr w:type="gramStart"/>
+      <w:r>
+        <w:rPr>
+          <w:rFonts w:ascii="Courier New" w:eastAsia="Times New Roman" w:hAnsi="Courier New" w:cs="Courier New"/>
+          <w:sz w:val="20"/>
+          <w:szCs w:val="20"/>
+        </w:rPr>
+        <w:t>develop</w:t>
+      </w:r>
+      <w:proofErr w:type="gramEnd"/>
     </w:p>
     <w:p>
       <w:pPr>
@@ -2089,6 +2237,7 @@
           <w:sz w:val="24"/>
           <w:szCs w:val="24"/>
         </w:rPr>
+        <w:lastRenderedPageBreak/>
         <w:t>Bash</w:t>
       </w:r>
     </w:p>
@@ -2207,9 +2356,18 @@
           <w:sz w:val="20"/>
           <w:szCs w:val="20"/>
         </w:rPr>
-        <w:lastRenderedPageBreak/>
-        <w:t>git add .</w:t>
-      </w:r>
+        <w:t xml:space="preserve">git </w:t>
+      </w:r>
+      <w:proofErr w:type="gramStart"/>
+      <w:r>
+        <w:rPr>
+          <w:rFonts w:ascii="Courier New" w:eastAsia="Times New Roman" w:hAnsi="Courier New" w:cs="Courier New"/>
+          <w:sz w:val="20"/>
+          <w:szCs w:val="20"/>
+        </w:rPr>
+        <w:t>add .</w:t>
+      </w:r>
+      <w:proofErr w:type="gramEnd"/>
     </w:p>
     <w:p>
       <w:pPr>
@@ -2515,6 +2673,7 @@
           <w:szCs w:val="24"/>
         </w:rPr>
       </w:pPr>
+      <w:proofErr w:type="gramStart"/>
       <w:r>
         <w:rPr>
           <w:rFonts w:ascii="Times New Roman" w:eastAsia="Times New Roman" w:hAnsi="Symbol" w:cs="Times New Roman"/>
@@ -2537,7 +2696,16 @@
           <w:sz w:val="20"/>
           <w:szCs w:val="20"/>
         </w:rPr>
-        <w:t>git clone &lt;link-repo&gt;</w:t>
+        <w:t>git</w:t>
+      </w:r>
+      <w:proofErr w:type="gramEnd"/>
+      <w:r>
+        <w:rPr>
+          <w:rFonts w:ascii="Courier New" w:eastAsia="Times New Roman" w:hAnsi="Courier New" w:cs="Courier New"/>
+          <w:sz w:val="20"/>
+          <w:szCs w:val="20"/>
+        </w:rPr>
+        <w:t xml:space="preserve"> clone &lt;link-repo&gt;</w:t>
       </w:r>
     </w:p>
     <w:p>
@@ -2554,6 +2722,7 @@
           <w:szCs w:val="24"/>
         </w:rPr>
       </w:pPr>
+      <w:proofErr w:type="gramStart"/>
       <w:r>
         <w:rPr>
           <w:rFonts w:ascii="Times New Roman" w:eastAsia="Times New Roman" w:hAnsi="Symbol" w:cs="Times New Roman"/>
@@ -2576,7 +2745,16 @@
           <w:sz w:val="20"/>
           <w:szCs w:val="20"/>
         </w:rPr>
-        <w:t>git checkout develop</w:t>
+        <w:t>git</w:t>
+      </w:r>
+      <w:proofErr w:type="gramEnd"/>
+      <w:r>
+        <w:rPr>
+          <w:rFonts w:ascii="Courier New" w:eastAsia="Times New Roman" w:hAnsi="Courier New" w:cs="Courier New"/>
+          <w:sz w:val="20"/>
+          <w:szCs w:val="20"/>
+        </w:rPr>
+        <w:t xml:space="preserve"> checkout develop</w:t>
       </w:r>
       <w:r>
         <w:rPr>
@@ -2601,6 +2779,7 @@
           <w:szCs w:val="24"/>
         </w:rPr>
       </w:pPr>
+      <w:proofErr w:type="gramStart"/>
       <w:r>
         <w:rPr>
           <w:rFonts w:ascii="Times New Roman" w:eastAsia="Times New Roman" w:hAnsi="Symbol" w:cs="Times New Roman"/>
@@ -2623,7 +2802,16 @@
           <w:sz w:val="20"/>
           <w:szCs w:val="20"/>
         </w:rPr>
-        <w:t>npm install</w:t>
+        <w:t>npm</w:t>
+      </w:r>
+      <w:proofErr w:type="gramEnd"/>
+      <w:r>
+        <w:rPr>
+          <w:rFonts w:ascii="Courier New" w:eastAsia="Times New Roman" w:hAnsi="Courier New" w:cs="Courier New"/>
+          <w:sz w:val="20"/>
+          <w:szCs w:val="20"/>
+        </w:rPr>
+        <w:t xml:space="preserve"> install</w:t>
       </w:r>
       <w:r>
         <w:rPr>
@@ -2648,6 +2836,7 @@
           <w:szCs w:val="24"/>
         </w:rPr>
       </w:pPr>
+      <w:proofErr w:type="gramStart"/>
       <w:r>
         <w:rPr>
           <w:rFonts w:ascii="Times New Roman" w:eastAsia="Times New Roman" w:hAnsi="Symbol" w:cs="Times New Roman"/>
@@ -2670,7 +2859,16 @@
           <w:sz w:val="20"/>
           <w:szCs w:val="20"/>
         </w:rPr>
-        <w:t>cd client</w:t>
+        <w:t>cd</w:t>
+      </w:r>
+      <w:proofErr w:type="gramEnd"/>
+      <w:r>
+        <w:rPr>
+          <w:rFonts w:ascii="Courier New" w:eastAsia="Times New Roman" w:hAnsi="Courier New" w:cs="Courier New"/>
+          <w:sz w:val="20"/>
+          <w:szCs w:val="20"/>
+        </w:rPr>
+        <w:t xml:space="preserve"> client</w:t>
       </w:r>
       <w:r>
         <w:rPr>
@@ -2711,6 +2909,7 @@
           <w:szCs w:val="24"/>
         </w:rPr>
       </w:pPr>
+      <w:proofErr w:type="gramStart"/>
       <w:r>
         <w:rPr>
           <w:rFonts w:ascii="Times New Roman" w:eastAsia="Times New Roman" w:hAnsi="Symbol" w:cs="Times New Roman"/>
@@ -2725,7 +2924,16 @@
           <w:sz w:val="24"/>
           <w:szCs w:val="24"/>
         </w:rPr>
-        <w:t xml:space="preserve">  Tạo nhánh mới: </w:t>
+        <w:t xml:space="preserve">  Tạo</w:t>
+      </w:r>
+      <w:proofErr w:type="gramEnd"/>
+      <w:r>
+        <w:rPr>
+          <w:rFonts w:ascii="Times New Roman" w:eastAsia="Times New Roman" w:hAnsi="Times New Roman" w:cs="Times New Roman"/>
+          <w:sz w:val="24"/>
+          <w:szCs w:val="24"/>
+        </w:rPr>
+        <w:t xml:space="preserve"> nhánh mới: </w:t>
       </w:r>
       <w:r>
         <w:rPr>

</xml_diff>